<commit_message>
Docs: say plainly there is no ASIO support, fix wrong ASIO advice
The bundled PortAudio has no ASIO host API. User Guide told Windows users
an ASIO driver would help (it can't); replaced with WASAPI/WDM-KS advice
and a No ASIO support note. README and download page now say no ASIO
driver is needed.

Co-Authored-By: Claude Sonnet 5.5 <noreply@anthropic.com>
</commit_message>
<xml_diff>
--- a/SoloTone_User_Guide.docx
+++ b/SoloTone_User_Guide.docx
@@ -2192,6 +2192,11 @@
       </w:r>
     </w:p>
     <w:p>
+      <w:r>
+        <w:t>No ASIO support: SoloTone talks to your audio hardware through the PortAudio build bundled with the sounddevice package, which has no ASIO host API (Windows exposes MME, DirectSound, WASAPI and WDM-KS instead). You do not need an ASIO driver, and installing one (ASIO4ALL, or an interface maker’s own ASIO driver) will not make it appear. Pick your interface under WASAPI or WDM-KS in the Host API dropdown. If your interface only works well through ASIO, tell the developer which model it is.</w:t>
+      </w:r>
+    </w:p>
+    <w:p>
       <w:pPr>
         <w:pStyle w:val="Heading2"/>
         <w:spacing w:after="80" w:before="240"/>
@@ -5727,7 +5732,7 @@
           <w:sz w:val="22"/>
           <w:szCs w:val="22"/>
         </w:rPr>
-        <w:t xml:space="preserve">If the xrun counter on the Amp tab climbs, your block size is too small for your hardware. Try increasing from 256 to 512. On Windows, an ASIO driver (via ASIO4ALL or your interface own driver) usually gives better low-latency performance than the default WDM path.</w:t>
+        <w:t>If the xrun counter on the Amp tab climbs, your block size is too small for your hardware. Try increasing from 256 to 512. On Windows, try the WDM-KS or WASAPI option in the Host API dropdown (I/O &amp; Levels tab) — SoloTone does not support ASIO, so ASIO drivers such as ASIO4ALL will not appear (see No ASIO support, above).</w:t>
       </w:r>
     </w:p>
     <w:p>
@@ -5811,7 +5816,7 @@
           <w:sz w:val="22"/>
           <w:szCs w:val="22"/>
         </w:rPr>
-        <w:t xml:space="preserve">All layers share a common loop position derived from sample counts, so they cannot drift relative to each other. If layers sound out of sync with your playing, the most likely cause is latency — the time between playing and hearing. Use a lower block size and, on Windows, an ASIO driver to reduce round-trip latency before recording your first loop.</w:t>
+        <w:t>All layers share a common loop position derived from sample counts, so they cannot drift relative to each other. If layers sound out of sync with your playing, the most likely cause is latency — the time between playing and hearing. Use a lower block size and, on Windows, the WASAPI or WDM-KS Host API to reduce round-trip latency before recording your first loop.</w:t>
       </w:r>
     </w:p>
     <w:p>

</xml_diff>